<commit_message>
STROBE cohort checklist, STROBE items 8/9/12c/13 in manuscript, table footnotes
- STROBE checklist (cohort).docx replaces the CARE checklist
- Manuscript: data source, selection-bias measure, no missing data, participant flow (highlighted)
- Tables 1-4: abbreviation footnotes (highlighted), tables unfloated, Table 3 typo
- response-3.docx: checklist change noted for editor and Reviewer #3

Co-Authored-By: Claude Opus 5.5 <noreply@anthropic.com>
</commit_message>
<xml_diff>
--- a/Table 1.docx
+++ b/Table 1.docx
@@ -831,6 +831,31 @@
         </w:tc>
       </w:tr>
     </w:tbl>
+    <w:p>
+      <w:pPr>
+        <w:keepNext/>
+        <w:keepLines/>
+        <w:spacing w:before="200" w:after="0" w:line="276" w:lineRule="auto"/>
+        <w:outlineLvl w:val="1"/>
+        <w:rPr>
+          <w:rFonts w:ascii="Times New Roman" w:eastAsia="MS Gothic" w:hAnsi="Times New Roman" w:cs="Times New Roman"/>
+          <w:b/>
+          <w:bCs/>
+          <w:color w:val="4F81BD"/>
+          <w:kern w:val="0"/>
+          <w:lang w:val="en-US"/>
+          <w14:ligatures w14:val="none"/>
+        </w:rPr>
+      </w:pPr>
+      <w:r>
+        <w:rPr>
+          <w:rFonts w:ascii="Times New Roman" w:hAnsi="Times New Roman"/>
+          <w:sz w:val="20"/>
+          <w:highlight w:val="yellow"/>
+        </w:rPr>
+        <w:t>ASA = American Society of Anesthesiologists physical status, BMI = body mass index, BSA = body surface area, IQR = interquartile range.</w:t>
+      </w:r>
+    </w:p>
     <w:p>
       <w:pPr>
         <w:spacing w:after="200" w:line="276" w:lineRule="auto"/>

</xml_diff>

<commit_message>
Revert to first revision (be49086); STROBE checklist in author-provided format
- Manuscript, response-3 and Tables 1-4 restored to first revised version
- Removed generated STROBE checklist (cohort).docx
- STROBE Checklist - revised.doc: page numbers for the first revised manuscript

Co-Authored-By: Claude Opus 5.5 <noreply@anthropic.com>
</commit_message>
<xml_diff>
--- a/Table 1.docx
+++ b/Table 1.docx
@@ -831,31 +831,6 @@
         </w:tc>
       </w:tr>
     </w:tbl>
-    <w:p>
-      <w:pPr>
-        <w:keepNext/>
-        <w:keepLines/>
-        <w:spacing w:before="200" w:after="0" w:line="276" w:lineRule="auto"/>
-        <w:outlineLvl w:val="1"/>
-        <w:rPr>
-          <w:rFonts w:ascii="Times New Roman" w:eastAsia="MS Gothic" w:hAnsi="Times New Roman" w:cs="Times New Roman"/>
-          <w:b/>
-          <w:bCs/>
-          <w:color w:val="4F81BD"/>
-          <w:kern w:val="0"/>
-          <w:lang w:val="en-US"/>
-          <w14:ligatures w14:val="none"/>
-        </w:rPr>
-      </w:pPr>
-      <w:r>
-        <w:rPr>
-          <w:rFonts w:ascii="Times New Roman" w:hAnsi="Times New Roman"/>
-          <w:sz w:val="20"/>
-          <w:highlight w:val="yellow"/>
-        </w:rPr>
-        <w:t>ASA = American Society of Anesthesiologists physical status, BMI = body mass index, BSA = body surface area, IQR = interquartile range.</w:t>
-      </w:r>
-    </w:p>
     <w:p>
       <w:pPr>
         <w:spacing w:after="200" w:line="276" w:lineRule="auto"/>

</xml_diff>